<commit_message>
Retire old recipe references, combined notices in proposal templates, ChatGPT deck guardrails
- Stale: investor deck rules, starter notice, superseded prototype builders, and reference examples (report, contract, overview) that showed the old recipe, worded close and old footers
- Proposals: proposal classification, recipient and validity required for release; per-section stricter status; closing distribution notice; new proposal deck starter; Word contract template footer
- Decks: notice footer on agenda, dividers and key number; qa.py checks notices and 16:9 on any PPTX
- ChatGPT: rewritten project instructions and a new brand/DECK-CHECKLIST.md
</commit_message>
<xml_diff>
--- a/templates/ocean-legal-template.docx
+++ b/templates/ocean-legal-template.docx
@@ -67,11 +67,11 @@
       <w:pStyle w:val="OceanFooter"/>
     </w:pPr>
     <w:r>
-      <w:t>OCN-XXX-0000 · v1.0</w:t>
+      <w:t>OCN-XXX-0000 · v1.0 · Confidential · Draft · Do not use</w:t>
       <w:tab/>
       <w:t>Page X of Y</w:t>
       <w:tab/>
-      <w:t>Confidential</w:t>
+      <w:t>Initials ____</w:t>
     </w:r>
   </w:p>
 </w:ftr>
@@ -84,11 +84,11 @@
       <w:pStyle w:val="OceanFooter"/>
     </w:pPr>
     <w:r>
-      <w:t>OCN-XXX-0000 · v1.0</w:t>
+      <w:t>OCN-XXX-0000 · v1.0 · Confidential · Draft · Do not use</w:t>
       <w:tab/>
       <w:t>Page X of Y</w:t>
       <w:tab/>
-      <w:t>Confidential</w:t>
+      <w:t>Initials ____</w:t>
     </w:r>
   </w:p>
 </w:ftr>

</xml_diff>